<commit_message>
modified resume from Claude to state llm
</commit_message>
<xml_diff>
--- a/Steven_Bui_Resume_Technical.docx
+++ b/Steven_Bui_Resume_Technical.docx
@@ -190,7 +190,7 @@
           <w:rtl w:val="0"/>
           <w:lang w:val="en-US"/>
         </w:rPr>
-        <w:t xml:space="preserve">Hands-on infrastructure engineer with 20+ years designing and building cloud-native architecture, multi-cloud migrations, and automation pipelines at enterprise scale. Deep technical experience spans generative AI integration (engineered and trained Claude for air-gapped enterprise workflows), Kubernetes and containerization, infrastructure-as-code, and network/systems engineering across AWS, Alibaba Cloud, and OpenStack. Comfortable operating across the stack </w:t>
+        <w:t xml:space="preserve">Hands-on infrastructure engineer with 20+ years designing and building cloud-native architecture, multi-cloud migrations, and automation pipelines at enterprise scale. Deep technical experience spans generative AI integration (built LLM-assisted workflows for air-gapped enterprise environments), Kubernetes and containerization, infrastructure-as-code, and network/systems engineering across AWS, Alibaba Cloud, and OpenStack. Comfortable operating across the stack </w:t>
       </w:r>
       <w:r>
         <w:rPr>
@@ -572,7 +572,7 @@
           <w:rtl w:val="0"/>
           <w:lang w:val="en-US"/>
         </w:rPr>
-        <w:t>Engineered and trained Claude to understand air-gapped design requirements, embedding generative AI capabilities within core platforms and cloud environments.</w:t>
+        <w:t>Built LLM-assisted workflows for air-gapped design requirements, embedding generative AI capabilities within core platforms and cloud environments.</w:t>
       </w:r>
     </w:p>
     <w:p>

</xml_diff>